<commit_message>
Set Collective rules effective date to 22 October 2026 in web and DOCX copies
</commit_message>
<xml_diff>
--- a/public/docs/collective/v1.0/Regulamin_Vesteri_Collective_v1.0_PL.docx
+++ b/public/docs/collective/v1.0/Regulamin_Vesteri_Collective_v1.0_PL.docx
@@ -55,9 +55,8 @@
           <w:color w:val="666666"/>
           <w:sz w:val="19"/>
           <w:szCs w:val="19"/>
-          <w:highlight w:val="yellow"/>
-        </w:rPr>
-        <w:t xml:space="preserve">[data wejścia w życie]</w:t>
+        </w:rPr>
+        <w:t xml:space="preserve">22 października 2026 r.</w:t>
       </w:r>
       <w:r>
         <w:rPr>

</xml_diff>

<commit_message>
Synchronize Collective Rules downloads with current online terms
</commit_message>
<xml_diff>
--- a/public/docs/collective/v1.0/Regulamin_Vesteri_Collective_v1.0_PL.docx
+++ b/public/docs/collective/v1.0/Regulamin_Vesteri_Collective_v1.0_PL.docx
@@ -114,9 +114,8 @@
           <w:rFonts w:ascii="Calibri" w:cs="Calibri" w:eastAsia="Calibri" w:hAnsi="Calibri"/>
           <w:sz w:val="21"/>
           <w:szCs w:val="21"/>
-          <w:highlight w:val="yellow"/>
-        </w:rPr>
-        <w:t xml:space="preserve">[collective@vesteri.com]</w:t>
+        </w:rPr>
+        <w:t xml:space="preserve">collective@vesteri.com</w:t>
       </w:r>
       <w:r>
         <w:rPr>
@@ -1172,9 +1171,8 @@
           <w:rFonts w:ascii="Calibri" w:cs="Calibri" w:eastAsia="Calibri" w:hAnsi="Calibri"/>
           <w:sz w:val="21"/>
           <w:szCs w:val="21"/>
-          <w:highlight w:val="yellow"/>
-        </w:rPr>
-        <w:t xml:space="preserve">[60%]</w:t>
+        </w:rPr>
+        <w:t xml:space="preserve">60%</w:t>
       </w:r>
       <w:r>
         <w:rPr>
@@ -1465,9 +1463,8 @@
           <w:rFonts w:ascii="Calibri" w:cs="Calibri" w:eastAsia="Calibri" w:hAnsi="Calibri"/>
           <w:sz w:val="21"/>
           <w:szCs w:val="21"/>
-          <w:highlight w:val="yellow"/>
-        </w:rPr>
-        <w:t xml:space="preserve">[collective@vesteri.com]</w:t>
+        </w:rPr>
+        <w:t xml:space="preserve">collective@vesteri.com</w:t>
       </w:r>
       <w:r>
         <w:rPr>
@@ -1600,24 +1597,23 @@
           <w:sz w:val="21"/>
           <w:szCs w:val="21"/>
         </w:rPr>
-        <w:t xml:space="preserve">Od decyzji przysługuje odwołanie w ciągu 14 dni do </w:t>
-      </w:r>
-      <w:r>
-        <w:rPr>
-          <w:rFonts w:ascii="Calibri" w:cs="Calibri" w:eastAsia="Calibri" w:hAnsi="Calibri"/>
-          <w:sz w:val="21"/>
-          <w:szCs w:val="21"/>
-          <w:highlight w:val="yellow"/>
-        </w:rPr>
-        <w:t xml:space="preserve">[Zarządu Time2Show, Inc.]</w:t>
-      </w:r>
-      <w:r>
-        <w:rPr>
-          <w:rFonts w:ascii="Calibri" w:cs="Calibri" w:eastAsia="Calibri" w:hAnsi="Calibri"/>
-          <w:sz w:val="21"/>
-          <w:szCs w:val="21"/>
-        </w:rPr>
-        <w:t xml:space="preserve">, rozpatrywane w ciągu 30 dni. Decyzja odwoławcza jest ostateczna w ramach Collective i nie wyłącza drogi sądowej.</w:t>
+        <w:t xml:space="preserve">Od decyzji przysługuje odwołanie w ciągu 14 dni, rozpatrywane w ciągu 30 dni. Dopóki Collective liczy nie więcej niż 100 Członków, odwołania rozpatruje Zarząd (Board of Directors) Time2Show, Inc. Po przekroczeniu 100 Członków powoływana jest Komisja Collective, która przejmuje rozpatrywanie odwołań. Decyzja odwoławcza jest ostateczna w ramach Collective i nie wyłącza drogi sądowej.</w:t>
+      </w:r>
+      <w:r>
+        <w:rPr>
+          <w:rFonts w:ascii="Calibri" w:cs="Calibri" w:eastAsia="Calibri" w:hAnsi="Calibri"/>
+          <w:sz w:val="21"/>
+          <w:szCs w:val="21"/>
+        </w:rPr>
+        <w:t xml:space="preserve"/>
+      </w:r>
+      <w:r>
+        <w:rPr>
+          <w:rFonts w:ascii="Calibri" w:cs="Calibri" w:eastAsia="Calibri" w:hAnsi="Calibri"/>
+          <w:sz w:val="21"/>
+          <w:szCs w:val="21"/>
+        </w:rPr>
+        <w:t xml:space="preserve"/>
       </w:r>
     </w:p>
     <w:p>
@@ -2000,9 +1996,8 @@
           <w:rFonts w:ascii="Calibri" w:cs="Calibri" w:eastAsia="Calibri" w:hAnsi="Calibri"/>
           <w:sz w:val="21"/>
           <w:szCs w:val="21"/>
-          <w:highlight w:val="yellow"/>
-        </w:rPr>
-        <w:t xml:space="preserve">[polska]</w:t>
+        </w:rPr>
+        <w:t xml:space="preserve">polska</w:t>
       </w:r>
       <w:r>
         <w:rPr>

</xml_diff>